<commit_message>
Add confirmed report authors and shared NMIMS affiliation
</commit_message>
<xml_diff>
--- a/assignment_docs/updated/Cloud_Equipment_Monitoring_LNCS.docx
+++ b/assignment_docs/updated/Cloud_Equipment_Monitoring_LNCS.docx
@@ -10,6 +10,82 @@
       </w:pPr>
       <w:r>
         <w:t>Predictive Maintenance and Monitoring of Simulated Industrial Equipment on AWS</w:t>
+      </w:r>
+    </w:p>
+    <w:p>
+      <w:pPr>
+        <w:keepNext/>
+        <w:widowControl/>
+        <w:ind w:firstLine="0"/>
+        <w:jc w:val="center"/>
+      </w:pPr>
+      <w:r>
+        <w:rPr>
+          <w:rFonts w:ascii="Times New Roman" w:hAnsi="Times New Roman"/>
+          <w:sz w:val="20"/>
+        </w:rPr>
+        <w:t>Joel Jacob, Kanish Jain, Kaivalya Joglekar,</w:t>
+      </w:r>
+    </w:p>
+    <w:p>
+      <w:pPr>
+        <w:keepNext/>
+        <w:widowControl/>
+        <w:ind w:firstLine="0"/>
+        <w:jc w:val="center"/>
+      </w:pPr>
+      <w:r>
+        <w:rPr>
+          <w:rFonts w:ascii="Times New Roman" w:hAnsi="Times New Roman"/>
+          <w:sz w:val="20"/>
+        </w:rPr>
+        <w:t>Akshay Kripalani and Manas Kulkarni</w:t>
+      </w:r>
+    </w:p>
+    <w:p>
+      <w:pPr>
+        <w:keepNext/>
+        <w:widowControl/>
+        <w:ind w:firstLine="0"/>
+        <w:jc w:val="center"/>
+      </w:pPr>
+      <w:r>
+        <w:rPr>
+          <w:rFonts w:ascii="Times New Roman" w:hAnsi="Times New Roman"/>
+          <w:sz w:val="18"/>
+        </w:rPr>
+        <w:t>Department of Computer Engineering</w:t>
+      </w:r>
+    </w:p>
+    <w:p>
+      <w:pPr>
+        <w:keepNext/>
+        <w:widowControl/>
+        <w:ind w:firstLine="0"/>
+        <w:jc w:val="center"/>
+      </w:pPr>
+      <w:r>
+        <w:rPr>
+          <w:rFonts w:ascii="Times New Roman" w:hAnsi="Times New Roman"/>
+          <w:sz w:val="18"/>
+        </w:rPr>
+        <w:t>Mukesh Patel School of Technology Management and Engineering</w:t>
+      </w:r>
+    </w:p>
+    <w:p>
+      <w:pPr>
+        <w:keepNext/>
+        <w:widowControl/>
+        <w:spacing w:after="240"/>
+        <w:ind w:firstLine="0"/>
+        <w:jc w:val="center"/>
+      </w:pPr>
+      <w:r>
+        <w:rPr>
+          <w:rFonts w:ascii="Times New Roman" w:hAnsi="Times New Roman"/>
+          <w:sz w:val="18"/>
+        </w:rPr>
+        <w:t>NMIMS, Mumbai, India</w:t>
       </w:r>
     </w:p>
     <w:p>

</xml_diff>

<commit_message>
Update author order and add faculty coauthor and contact emails
</commit_message>
<xml_diff>
--- a/assignment_docs/updated/Cloud_Equipment_Monitoring_LNCS.docx
+++ b/assignment_docs/updated/Cloud_Equipment_Monitoring_LNCS.docx
@@ -24,7 +24,7 @@
           <w:rFonts w:ascii="Times New Roman" w:hAnsi="Times New Roman"/>
           <w:sz w:val="20"/>
         </w:rPr>
-        <w:t>Joel Jacob, Kanish Jain, Kaivalya Joglekar,</w:t>
+        <w:t>Akshay Kripalani, Joel Jacob, Kaivalya Joglekar,</w:t>
       </w:r>
     </w:p>
     <w:p>
@@ -39,7 +39,7 @@
           <w:rFonts w:ascii="Times New Roman" w:hAnsi="Times New Roman"/>
           <w:sz w:val="20"/>
         </w:rPr>
-        <w:t>Akshay Kripalani and Manas Kulkarni</w:t>
+        <w:t>Kanish Jain, Manas Kulkarni and Rama Varshney</w:t>
       </w:r>
     </w:p>
     <w:p>
@@ -76,6 +76,66 @@
       <w:pPr>
         <w:keepNext/>
         <w:widowControl/>
+        <w:ind w:firstLine="0"/>
+        <w:jc w:val="center"/>
+      </w:pPr>
+      <w:r>
+        <w:rPr>
+          <w:rFonts w:ascii="Times New Roman" w:hAnsi="Times New Roman"/>
+          <w:sz w:val="18"/>
+        </w:rPr>
+        <w:t>NMIMS, Mumbai, India</w:t>
+      </w:r>
+    </w:p>
+    <w:p>
+      <w:pPr>
+        <w:keepNext/>
+        <w:widowControl/>
+        <w:ind w:firstLine="0"/>
+        <w:jc w:val="center"/>
+      </w:pPr>
+      <w:r>
+        <w:rPr>
+          <w:rFonts w:ascii="Times New Roman" w:hAnsi="Times New Roman"/>
+          <w:sz w:val="18"/>
+        </w:rPr>
+        <w:t>Rama Varshney: Assistant Professor</w:t>
+      </w:r>
+    </w:p>
+    <w:p>
+      <w:pPr>
+        <w:keepNext/>
+        <w:widowControl/>
+        <w:ind w:firstLine="0"/>
+        <w:jc w:val="center"/>
+      </w:pPr>
+      <w:r>
+        <w:rPr>
+          <w:rFonts w:ascii="Times New Roman" w:hAnsi="Times New Roman"/>
+          <w:sz w:val="16"/>
+        </w:rPr>
+        <w:t>akshay.kripalani74@nmims.in, joelchirayil.jacob78@nmims.in</w:t>
+      </w:r>
+    </w:p>
+    <w:p>
+      <w:pPr>
+        <w:keepNext/>
+        <w:widowControl/>
+        <w:ind w:firstLine="0"/>
+        <w:jc w:val="center"/>
+      </w:pPr>
+      <w:r>
+        <w:rPr>
+          <w:rFonts w:ascii="Times New Roman" w:hAnsi="Times New Roman"/>
+          <w:sz w:val="16"/>
+        </w:rPr>
+        <w:t>kaivalyarakesh.joglekar57@nmims.in, kanish.jain82@nmims.in</w:t>
+      </w:r>
+    </w:p>
+    <w:p>
+      <w:pPr>
+        <w:keepNext/>
+        <w:widowControl/>
         <w:spacing w:after="240"/>
         <w:ind w:firstLine="0"/>
         <w:jc w:val="center"/>
@@ -83,9 +143,9 @@
       <w:r>
         <w:rPr>
           <w:rFonts w:ascii="Times New Roman" w:hAnsi="Times New Roman"/>
-          <w:sz w:val="18"/>
-        </w:rPr>
-        <w:t>NMIMS, Mumbai, India</w:t>
+          <w:sz w:val="16"/>
+        </w:rPr>
+        <w:t>manas.kulkarni73@nmims.in, rama.varshney@nmims.edu</w:t>
       </w:r>
     </w:p>
     <w:p>

</xml_diff>